<commit_message>
Replace draft report with final Phase 2 documentation
</commit_message>
<xml_diff>
--- a/docs/Project_Phase2_Cloud_Dashboard_Documentation.docx
+++ b/docs/Project_Phase2_Cloud_Dashboard_Documentation.docx
@@ -85,14 +85,8 @@
             <w:vAlign w:val="center"/>
           </w:tcPr>
           <w:p>
-            <w:pPr>
-              <w:spacing w:after="100" w:before="100"/>
-            </w:pPr>
             <w:r>
-              <w:rPr>
-                <w:color w:val="24183B"/>
-              </w:rPr>
-              <w:t>Anagha Roy, Jasmeen, and Manya Sethi</w:t>
+              <w:t>Anagha Roy, Jasmeen Garcha, and Manya Sethi</w:t>
             </w:r>
           </w:p>
         </w:tc>
@@ -171,14 +165,8 @@
             <w:vAlign w:val="center"/>
           </w:tcPr>
           <w:p>
-            <w:pPr>
-              <w:spacing w:after="100" w:before="100"/>
-            </w:pPr>
             <w:r>
-              <w:rPr>
-                <w:color w:val="24183B"/>
-              </w:rPr>
-              <w:t>[Course / Section]</w:t>
+              <w:t>CPSY 300 - Cloud Computing for Software Development (CPSY_300_D)</w:t>
             </w:r>
           </w:p>
         </w:tc>
@@ -214,14 +202,8 @@
             <w:vAlign w:val="center"/>
           </w:tcPr>
           <w:p>
-            <w:pPr>
-              <w:spacing w:after="100" w:before="100"/>
-            </w:pPr>
             <w:r>
-              <w:rPr>
-                <w:color w:val="24183B"/>
-              </w:rPr>
-              <w:t>[Instructor Name]</w:t>
+              <w:t>Sola Akinbode</w:t>
             </w:r>
           </w:p>
         </w:tc>
@@ -294,7 +276,7 @@
           <w:color w:val="5F3CDF"/>
           <w:sz w:val="24"/>
         </w:rPr>
-        <w:t>[PASTE AZURE STATIC WEB APP URL AFTER DEPLOYMENT]</w:t>
+        <w:t>https://kind-ocean-0f9378310.7.azurestaticapps.net</w:t>
       </w:r>
     </w:p>
     <w:p>
@@ -520,10 +502,7 @@
           </w:tcPr>
           <w:p>
             <w:r>
-              <w:rPr>
-                <w:sz w:val="17"/>
-              </w:rPr>
-              <w:t>Jasmeen - Member B</w:t>
+              <w:t>Jasmeen Garcha - Member B</w:t>
             </w:r>
           </w:p>
         </w:tc>
@@ -535,9 +514,6 @@
           </w:tcPr>
           <w:p>
             <w:r>
-              <w:rPr>
-                <w:sz w:val="17"/>
-              </w:rPr>
               <w:t>Frontend Dashboard</w:t>
             </w:r>
           </w:p>
@@ -550,10 +526,7 @@
           </w:tcPr>
           <w:p>
             <w:r>
-              <w:rPr>
-                <w:sz w:val="17"/>
-              </w:rPr>
-              <w:t>Initial dashboard interface and chart components.</w:t>
+              <w:t>Initial dashboard interface, chart components, and visual layout.</w:t>
             </w:r>
           </w:p>
         </w:tc>
@@ -622,6 +595,9 @@
       </w:pPr>
       <w:r>
         <w:t>The architecture separates storage, serverless compute, and frontend hosting. The browser never downloads the CSV directly. Instead, each Azure Function retrieves the live blob through the Azure Storage SDK, processes it with Pandas, and returns JSON to the dashboard.</w:t>
+      </w:r>
+      <w:r>
+        <w:t xml:space="preserve"> In the final team setup, the Function App and Storage Account are hosted in Anagha's Azure environment, while the production Static Web App is hosted in Manya's Azure for Students subscription. The exact frontend origin is authorized through Function App CORS.</w:t>
       </w:r>
     </w:p>
     <w:p>
@@ -882,7 +858,7 @@
               <w:rPr>
                 <w:sz w:val="17"/>
               </w:rPr>
-              <w:t>GitHub-connected deployment and publicly accessible URL.</w:t>
+              <w:t>Production deployment through the Azure Static Web Apps CLI (SWA CLI) and a publicly accessible HTTPS URL.</w:t>
             </w:r>
           </w:p>
         </w:tc>
@@ -914,7 +890,7 @@
               <w:rPr>
                 <w:sz w:val="17"/>
               </w:rPr>
-              <w:t>Stores frontend, backend, tests, workflow, and report.</w:t>
+              <w:t>Stores frontend, backend, tests, deployment guidance, and the final report.</w:t>
             </w:r>
           </w:p>
         </w:tc>
@@ -1710,6 +1686,9 @@
       <w:r>
         <w:t>The deployed functions use anonymous HTTP authorization, so the frontend does not require a function key. Because Azure Static Web Apps and Azure Functions use different origins, the exact frontend origin must be added to the Function App CORS allowed-origins list.</w:t>
       </w:r>
+      <w:r>
+        <w:t xml:space="preserve"> The production frontend origin used in the final configuration is https://kind-ocean-0f9378310.7.azurestaticapps.net.</w:t>
+      </w:r>
     </w:p>
     <w:tbl>
       <w:tblPr>
@@ -1752,7 +1731,9 @@
               <w:rPr>
                 <w:color w:val="645B6E"/>
               </w:rPr>
-              <w:t>After deployment, add the exact https://...azurestaticapps.net origin without a trailing slash. Use a specific origin rather than a wildcard in the final configuration.</w:t>
+              <w:t>Allowed frontend origin: https://kind-ocean-0f9378310.7.azurestaticapps.net</w:t>
+              <w:br/>
+              <w:t>Use the exact HTTPS origin without a trailing slash and avoid a wildcard in the final configuration.</w:t>
             </w:r>
           </w:p>
         </w:tc>
@@ -2122,9 +2103,6 @@
           </w:tcPr>
           <w:p>
             <w:r>
-              <w:rPr>
-                <w:sz w:val="17"/>
-              </w:rPr>
               <w:t>Responsive layout</w:t>
             </w:r>
           </w:p>
@@ -2136,10 +2114,7 @@
           </w:tcPr>
           <w:p>
             <w:r>
-              <w:rPr>
-                <w:sz w:val="17"/>
-              </w:rPr>
-              <w:t>Dashboard remains readable on desktop and mobile.</w:t>
+              <w:t>Dashboard remains readable at standard desktop widths and adapts through responsive CSS.</w:t>
             </w:r>
           </w:p>
         </w:tc>
@@ -2150,10 +2125,7 @@
           </w:tcPr>
           <w:p>
             <w:r>
-              <w:rPr>
-                <w:sz w:val="17"/>
-              </w:rPr>
-              <w:t>Browser responsive mode screenshot.</w:t>
+              <w:t>Live dashboard evidence and responsive CSS/media-query review.</w:t>
             </w:r>
           </w:p>
         </w:tc>
@@ -2498,7 +2470,7 @@
         <w:spacing w:after="140" w:line="269" w:lineRule="auto"/>
       </w:pPr>
       <w:r>
-        <w:t>The final main branch should contain the deployed Function source, the selected frontend folder, documentation files, deployment instructions, tests, and the Azure Static Web Apps workflow generated during deployment.</w:t>
+        <w:t>The final main branch contains the deployed Function source, the selected frontend folder, documentation files, deployment instructions, tests, and the completed integration evidence.</w:t>
       </w:r>
     </w:p>
     <w:p>
@@ -2552,7 +2524,7 @@
         <w:spacing w:after="80"/>
       </w:pPr>
       <w:r>
-        <w:t>Deploy Azure Static Web Apps from the final main branch.</w:t>
+        <w:t>Deploy the final /frontend folder to the Azure Static Web App production environment using SWA CLI.</w:t>
       </w:r>
     </w:p>
     <w:p>
@@ -2571,9 +2543,33 @@
     <w:p>
       <w:pPr>
         <w:spacing w:after="140" w:line="269" w:lineRule="auto"/>
+        <w:jc w:val="left"/>
+        <w:shd w:fill="F3EFFA"/>
+        <w:pBdr>
+          <w:bottom w:val="single" w:sz="8" w:color="B7A7D6" w:space="4"/>
+        </w:pBdr>
       </w:pPr>
       <w:r>
-        <w:t>Replace the boxes below with the team screenshots before exporting the final submission PDF. The editable DOCX is included so this can be completed quickly.</w:t>
+        <w:rPr>
+          <w:b/>
+          <w:color w:val="402C5C"/>
+          <w:sz w:val="21"/>
+        </w:rPr>
+      </w:r>
+      <w:r>
+        <w:rPr>
+          <w:b/>
+          <w:color w:val="402C5C"/>
+          <w:sz w:val="21"/>
+        </w:rPr>
+      </w:r>
+      <w:r>
+        <w:rPr>
+          <w:b/>
+          <w:color w:val="30234C"/>
+          <w:sz w:val="21"/>
+        </w:rPr>
+        <w:t>The complete production evidence is inserted below. It documents the deployed Static Web App, the backend resource group, the live Azure Blob dataset, all three Function endpoints, the Function App CORS configuration, the live dashboard, the HTTP 200 integration test, and the final GitHub main branch.</w:t>
       </w:r>
     </w:p>
     <w:p>
@@ -2585,7 +2581,7 @@
           <w:b/>
           <w:color w:val="24183B"/>
         </w:rPr>
-        <w:t>Figure 2. Azure resources and live Blob dataset</w:t>
+        <w:t>Figure 2. Azure resources and live Blob dataset (backend and frontend are hosted in separate Azure environments)</w:t>
       </w:r>
     </w:p>
     <w:tbl>
@@ -2601,27 +2597,35 @@
         <w:tc>
           <w:tcPr>
             <w:tcW w:type="dxa" w:w="10224"/>
-            <w:shd w:fill="F3F1F5"/>
+            <w:shd w:fill="FFFFFF"/>
             <w:tcBorders>
-              <w:top w:val="dashed" w:sz="10" w:color="A99FB5"/>
-              <w:left w:val="dashed" w:sz="10" w:color="A99FB5"/>
-              <w:bottom w:val="dashed" w:sz="10" w:color="A99FB5"/>
-              <w:right w:val="dashed" w:sz="10" w:color="A99FB5"/>
+              <w:top w:val="dashed" w:sz="12" w:color="B7A7D6"/>
+              <w:left w:val="dashed" w:sz="12" w:color="B7A7D6"/>
+              <w:bottom w:val="dashed" w:sz="12" w:color="B7A7D6"/>
+              <w:right w:val="dashed" w:sz="12" w:color="B7A7D6"/>
             </w:tcBorders>
             <w:vAlign w:val="center"/>
+            <w:tcMar>
+              <w:top w:w="90" w:type="dxa"/>
+              <w:start w:w="90" w:type="dxa"/>
+              <w:bottom w:w="90" w:type="dxa"/>
+              <w:end w:w="90" w:type="dxa"/>
+            </w:tcMar>
           </w:tcPr>
+          <w:p/>
           <w:p>
             <w:pPr>
-              <w:spacing w:after="140"/>
+              <w:keepNext/>
+              <w:keepLines/>
               <w:jc w:val="center"/>
             </w:pPr>
             <w:r>
               <w:rPr>
                 <w:b/>
-                <w:color w:val="5F3CDF"/>
-                <w:sz w:val="30"/>
+                <w:color w:val="373053"/>
+                <w:sz w:val="18"/>
               </w:rPr>
-              <w:t>INSERT SCREENSHOT HERE</w:t>
+              <w:t>Azure Static Web App production overview</w:t>
             </w:r>
           </w:p>
           <w:p>
@@ -2629,11 +2633,135 @@
               <w:jc w:val="center"/>
             </w:pPr>
             <w:r>
+              <w:drawing>
+                <wp:inline xmlns:a="http://schemas.openxmlformats.org/drawingml/2006/main" xmlns:pic="http://schemas.openxmlformats.org/drawingml/2006/picture">
+                  <wp:extent cx="6080760" cy="3817184"/>
+                  <wp:docPr id="2" name="Picture 2"/>
+                  <wp:cNvGraphicFramePr>
+                    <a:graphicFrameLocks noChangeAspect="1"/>
+                  </wp:cNvGraphicFramePr>
+                  <a:graphic>
+                    <a:graphicData uri="http://schemas.openxmlformats.org/drawingml/2006/picture">
+                      <pic:pic>
+                        <pic:nvPicPr>
+                          <pic:cNvPr id="0" name="Screenshot 2026-07-17 at 7.06.58 PM.png"/>
+                          <pic:cNvPicPr/>
+                        </pic:nvPicPr>
+                        <pic:blipFill>
+                          <a:blip r:embed="rId12"/>
+                          <a:stretch>
+                            <a:fillRect/>
+                          </a:stretch>
+                        </pic:blipFill>
+                        <pic:spPr>
+                          <a:xfrm>
+                            <a:off x="0" y="0"/>
+                            <a:ext cx="6080760" cy="3817184"/>
+                          </a:xfrm>
+                          <a:prstGeom prst="rect"/>
+                        </pic:spPr>
+                      </pic:pic>
+                    </a:graphicData>
+                  </a:graphic>
+                </wp:inline>
+              </w:drawing>
+            </w:r>
+          </w:p>
+          <w:p>
+            <w:pPr>
+              <w:pageBreakBefore/>
+              <w:spacing w:after="0"/>
+              <w:jc w:val="center"/>
+            </w:pPr>
+            <w:r>
+              <w:drawing>
+                <wp:inline xmlns:a="http://schemas.openxmlformats.org/drawingml/2006/main" xmlns:pic="http://schemas.openxmlformats.org/drawingml/2006/picture">
+                  <wp:extent cx="5989320" cy="2983862"/>
+                  <wp:docPr id="12" name="Picture 12"/>
+                  <wp:cNvGraphicFramePr>
+                    <a:graphicFrameLocks noChangeAspect="1"/>
+                  </wp:cNvGraphicFramePr>
+                  <a:graphic>
+                    <a:graphicData uri="http://schemas.openxmlformats.org/drawingml/2006/picture">
+                      <pic:pic>
+                        <pic:nvPicPr>
+                          <pic:cNvPr id="0" name="resource-group-with-caption.png"/>
+                          <pic:cNvPicPr/>
+                        </pic:nvPicPr>
+                        <pic:blipFill>
+                          <a:blip r:embed="rId22"/>
+                          <a:stretch>
+                            <a:fillRect/>
+                          </a:stretch>
+                        </pic:blipFill>
+                        <pic:spPr>
+                          <a:xfrm>
+                            <a:off x="0" y="0"/>
+                            <a:ext cx="5989320" cy="2983862"/>
+                          </a:xfrm>
+                          <a:prstGeom prst="rect"/>
+                        </pic:spPr>
+                      </pic:pic>
+                    </a:graphicData>
+                  </a:graphic>
+                </wp:inline>
+              </w:drawing>
+            </w:r>
+          </w:p>
+          <w:p>
+            <w:pPr>
+              <w:keepNext/>
+              <w:keepLines/>
+              <w:spacing w:before="160" w:after="80"/>
+              <w:jc w:val="center"/>
+            </w:pPr>
+            <w:r>
               <w:rPr>
-                <w:color w:val="645B6E"/>
-                <w:sz w:val="19"/>
+                <w:b/>
+                <w:color w:val="30234C"/>
+                <w:sz w:val="21"/>
               </w:rPr>
-              <w:t>Show the resource group containing the Function App, Storage Account, and Static Web App. Include a second image or crop showing datasets/All_Diets.csv.</w:t>
+              <w:t>Azure Blob Storage container - datasets/All_Diets.csv</w:t>
+            </w:r>
+          </w:p>
+          <w:p>
+            <w:pPr>
+              <w:spacing w:after="120"/>
+              <w:jc w:val="center"/>
+            </w:pPr>
+            <w:r>
+              <w:drawing>
+                <wp:inline xmlns:a="http://schemas.openxmlformats.org/drawingml/2006/main" xmlns:pic="http://schemas.openxmlformats.org/drawingml/2006/picture">
+                  <wp:extent cx="5989320" cy="2724709"/>
+                  <wp:docPr id="10" name="Picture 10"/>
+                  <wp:cNvGraphicFramePr>
+                    <a:graphicFrameLocks noChangeAspect="1"/>
+                  </wp:cNvGraphicFramePr>
+                  <a:graphic>
+                    <a:graphicData uri="http://schemas.openxmlformats.org/drawingml/2006/picture">
+                      <pic:pic>
+                        <pic:nvPicPr>
+                          <pic:cNvPr id="0" name="blob-container-cropped.png"/>
+                          <pic:cNvPicPr/>
+                        </pic:nvPicPr>
+                        <pic:blipFill>
+                          <a:blip r:embed="rId20"/>
+                          <a:stretch>
+                            <a:fillRect/>
+                          </a:stretch>
+                        </pic:blipFill>
+                        <pic:spPr>
+                          <a:xfrm>
+                            <a:off x="0" y="0"/>
+                            <a:ext cx="5989320" cy="2724709"/>
+                          </a:xfrm>
+                          <a:prstGeom prst="rect"/>
+                        </pic:spPr>
+                      </pic:pic>
+                    </a:graphicData>
+                  </a:graphic>
+                </wp:inline>
+              </w:drawing>
             </w:r>
           </w:p>
         </w:tc>
@@ -2655,6 +2783,7 @@
     </w:p>
     <w:p>
       <w:pPr>
+        <w:pageBreakBefore/>
         <w:spacing w:before="100" w:after="80"/>
       </w:pPr>
       <w:r>
@@ -2678,7 +2807,7 @@
         <w:tc>
           <w:tcPr>
             <w:tcW w:type="dxa" w:w="10224"/>
-            <w:shd w:fill="F3F1F5"/>
+            <w:shd w:fill="FFFFFF"/>
             <w:tcBorders>
               <w:top w:val="dashed" w:sz="10" w:color="A99FB5"/>
               <w:left w:val="dashed" w:sz="10" w:color="A99FB5"/>
@@ -2686,19 +2815,27 @@
               <w:right w:val="dashed" w:sz="10" w:color="A99FB5"/>
             </w:tcBorders>
             <w:vAlign w:val="center"/>
+            <w:tcMar>
+              <w:top w:w="90" w:type="dxa"/>
+              <w:start w:w="90" w:type="dxa"/>
+              <w:bottom w:w="90" w:type="dxa"/>
+              <w:end w:w="90" w:type="dxa"/>
+            </w:tcMar>
           </w:tcPr>
+          <w:p/>
           <w:p>
             <w:pPr>
-              <w:spacing w:after="140"/>
+              <w:keepNext/>
+              <w:keepLines/>
               <w:jc w:val="center"/>
             </w:pPr>
             <w:r>
               <w:rPr>
                 <w:b/>
-                <w:color w:val="5F3CDF"/>
-                <w:sz w:val="30"/>
+                <w:color w:val="373053"/>
+                <w:sz w:val="18"/>
               </w:rPr>
-              <w:t>INSERT SCREENSHOT HERE</w:t>
+              <w:t>GetNutritionalInsights - live JSON response</w:t>
             </w:r>
           </w:p>
           <w:p>
@@ -2706,11 +2843,133 @@
               <w:jc w:val="center"/>
             </w:pPr>
             <w:r>
+              <w:drawing>
+                <wp:inline xmlns:a="http://schemas.openxmlformats.org/drawingml/2006/main" xmlns:pic="http://schemas.openxmlformats.org/drawingml/2006/picture">
+                  <wp:extent cx="5989320" cy="3368992"/>
+                  <wp:docPr id="3" name="Picture 3"/>
+                  <wp:cNvGraphicFramePr>
+                    <a:graphicFrameLocks noChangeAspect="1"/>
+                  </wp:cNvGraphicFramePr>
+                  <a:graphic>
+                    <a:graphicData uri="http://schemas.openxmlformats.org/drawingml/2006/picture">
+                      <pic:pic>
+                        <pic:nvPicPr>
+                          <pic:cNvPr id="0" name="Screenshot (751).png"/>
+                          <pic:cNvPicPr/>
+                        </pic:nvPicPr>
+                        <pic:blipFill>
+                          <a:blip r:embed="rId13"/>
+                          <a:stretch>
+                            <a:fillRect/>
+                          </a:stretch>
+                        </pic:blipFill>
+                        <pic:spPr>
+                          <a:xfrm>
+                            <a:off x="0" y="0"/>
+                            <a:ext cx="5989320" cy="3368992"/>
+                          </a:xfrm>
+                          <a:prstGeom prst="rect"/>
+                        </pic:spPr>
+                      </pic:pic>
+                    </a:graphicData>
+                  </a:graphic>
+                </wp:inline>
+              </w:drawing>
+            </w:r>
+          </w:p>
+          <w:p>
+            <w:pPr>
+              <w:keepNext/>
+              <w:keepLines/>
+              <w:jc w:val="center"/>
+            </w:pPr>
+            <w:r>
               <w:rPr>
-                <w:color w:val="645B6E"/>
-                <w:sz w:val="19"/>
+                <w:b/>
+                <w:color w:val="373053"/>
+                <w:sz w:val="18"/>
               </w:rPr>
-              <w:t>Show GetNutritionalInsights, GetRecipes, and GetClusters returning JSON in a browser or Postman.</w:t>
+              <w:t>GetRecipes - live JSON response</w:t>
+            </w:r>
+          </w:p>
+          <w:p>
+            <w:pPr>
+              <w:jc w:val="center"/>
+            </w:pPr>
+            <w:r>
+              <w:drawing>
+                <wp:inline xmlns:a="http://schemas.openxmlformats.org/drawingml/2006/main" xmlns:pic="http://schemas.openxmlformats.org/drawingml/2006/picture">
+                  <wp:extent cx="5989320" cy="3368992"/>
+                  <wp:docPr id="4" name="Picture 4"/>
+                  <wp:cNvGraphicFramePr>
+                    <a:graphicFrameLocks noChangeAspect="1"/>
+                  </wp:cNvGraphicFramePr>
+                  <a:graphic>
+                    <a:graphicData uri="http://schemas.openxmlformats.org/drawingml/2006/picture">
+                      <pic:pic>
+                        <pic:nvPicPr>
+                          <pic:cNvPr id="0" name="Screenshot (752).png"/>
+                          <pic:cNvPicPr/>
+                        </pic:nvPicPr>
+                        <pic:blipFill>
+                          <a:blip r:embed="rId14"/>
+                          <a:stretch>
+                            <a:fillRect/>
+                          </a:stretch>
+                        </pic:blipFill>
+                        <pic:spPr>
+                          <a:xfrm>
+                            <a:off x="0" y="0"/>
+                            <a:ext cx="5989320" cy="3368992"/>
+                          </a:xfrm>
+                          <a:prstGeom prst="rect"/>
+                        </pic:spPr>
+                      </pic:pic>
+                    </a:graphicData>
+                  </a:graphic>
+                </wp:inline>
+              </w:drawing>
+            </w:r>
+          </w:p>
+          <w:p>
+            <w:pPr>
+              <w:pageBreakBefore/>
+              <w:spacing w:after="0"/>
+              <w:jc w:val="center"/>
+            </w:pPr>
+            <w:r>
+              <w:drawing>
+                <wp:inline xmlns:a="http://schemas.openxmlformats.org/drawingml/2006/main" xmlns:pic="http://schemas.openxmlformats.org/drawingml/2006/picture">
+                  <wp:extent cx="5989320" cy="3593592"/>
+                  <wp:docPr id="13" name="Picture 13"/>
+                  <wp:cNvGraphicFramePr>
+                    <a:graphicFrameLocks noChangeAspect="1"/>
+                  </wp:cNvGraphicFramePr>
+                  <a:graphic>
+                    <a:graphicData uri="http://schemas.openxmlformats.org/drawingml/2006/picture">
+                      <pic:pic>
+                        <pic:nvPicPr>
+                          <pic:cNvPr id="0" name="getclusters-with-caption.png"/>
+                          <pic:cNvPicPr/>
+                        </pic:nvPicPr>
+                        <pic:blipFill>
+                          <a:blip r:embed="rId23"/>
+                          <a:stretch>
+                            <a:fillRect/>
+                          </a:stretch>
+                        </pic:blipFill>
+                        <pic:spPr>
+                          <a:xfrm>
+                            <a:off x="0" y="0"/>
+                            <a:ext cx="5989320" cy="3593592"/>
+                          </a:xfrm>
+                          <a:prstGeom prst="rect"/>
+                        </pic:spPr>
+                      </pic:pic>
+                    </a:graphicData>
+                  </a:graphic>
+                </wp:inline>
+              </w:drawing>
             </w:r>
           </w:p>
         </w:tc>
@@ -2760,39 +3019,75 @@
         <w:tc>
           <w:tcPr>
             <w:tcW w:type="dxa" w:w="10224"/>
-            <w:shd w:fill="F3F1F5"/>
+            <w:shd w:fill="FFFFFF"/>
             <w:tcBorders>
-              <w:top w:val="dashed" w:sz="10" w:color="A99FB5"/>
-              <w:left w:val="dashed" w:sz="10" w:color="A99FB5"/>
-              <w:bottom w:val="dashed" w:sz="10" w:color="A99FB5"/>
-              <w:right w:val="dashed" w:sz="10" w:color="A99FB5"/>
+              <w:top w:val="dashed" w:sz="12" w:color="B7A7D6"/>
+              <w:left w:val="dashed" w:sz="12" w:color="B7A7D6"/>
+              <w:bottom w:val="dashed" w:sz="12" w:color="B7A7D6"/>
+              <w:right w:val="dashed" w:sz="12" w:color="B7A7D6"/>
             </w:tcBorders>
             <w:vAlign w:val="center"/>
+            <w:tcMar>
+              <w:top w:w="90" w:type="dxa"/>
+              <w:start w:w="90" w:type="dxa"/>
+              <w:bottom w:w="90" w:type="dxa"/>
+              <w:end w:w="90" w:type="dxa"/>
+            </w:tcMar>
           </w:tcPr>
           <w:p>
             <w:pPr>
-              <w:spacing w:after="140"/>
+              <w:keepNext/>
+              <w:keepLines/>
+              <w:spacing w:before="160" w:after="80"/>
               <w:jc w:val="center"/>
             </w:pPr>
             <w:r>
               <w:rPr>
                 <w:b/>
-                <w:color w:val="5F3CDF"/>
-                <w:sz w:val="30"/>
+                <w:color w:val="30234C"/>
+                <w:sz w:val="21"/>
               </w:rPr>
-              <w:t>INSERT SCREENSHOT HERE</w:t>
+              <w:t>Function App CORS allowed origins</w:t>
             </w:r>
           </w:p>
           <w:p>
             <w:pPr>
+              <w:spacing w:after="120"/>
               <w:jc w:val="center"/>
             </w:pPr>
             <w:r>
-              <w:rPr>
-                <w:color w:val="645B6E"/>
-                <w:sz w:val="19"/>
-              </w:rPr>
-              <w:t>Show the exact Azure Static Web App URL in the Function App Allowed Origins list.</w:t>
+              <w:drawing>
+                <wp:inline xmlns:a="http://schemas.openxmlformats.org/drawingml/2006/main" xmlns:pic="http://schemas.openxmlformats.org/drawingml/2006/picture">
+                  <wp:extent cx="5989320" cy="2724709"/>
+                  <wp:docPr id="11" name="Picture 11"/>
+                  <wp:cNvGraphicFramePr>
+                    <a:graphicFrameLocks noChangeAspect="1"/>
+                  </wp:cNvGraphicFramePr>
+                  <a:graphic>
+                    <a:graphicData uri="http://schemas.openxmlformats.org/drawingml/2006/picture">
+                      <pic:pic>
+                        <pic:nvPicPr>
+                          <pic:cNvPr id="0" name="function-app-cors-cropped.png"/>
+                          <pic:cNvPicPr/>
+                        </pic:nvPicPr>
+                        <pic:blipFill>
+                          <a:blip r:embed="rId21"/>
+                          <a:stretch>
+                            <a:fillRect/>
+                          </a:stretch>
+                        </pic:blipFill>
+                        <pic:spPr>
+                          <a:xfrm>
+                            <a:off x="0" y="0"/>
+                            <a:ext cx="5989320" cy="2724709"/>
+                          </a:xfrm>
+                          <a:prstGeom prst="rect"/>
+                        </pic:spPr>
+                      </pic:pic>
+                    </a:graphicData>
+                  </a:graphic>
+                </wp:inline>
+              </w:drawing>
             </w:r>
           </w:p>
         </w:tc>
@@ -2814,6 +3109,8 @@
     </w:p>
     <w:p>
       <w:pPr>
+        <w:keepNext/>
+        <w:pageBreakBefore/>
         <w:spacing w:before="100" w:after="80"/>
       </w:pPr>
       <w:r>
@@ -2837,7 +3134,7 @@
         <w:tc>
           <w:tcPr>
             <w:tcW w:type="dxa" w:w="10224"/>
-            <w:shd w:fill="F3F1F5"/>
+            <w:shd w:fill="FFFFFF"/>
             <w:tcBorders>
               <w:top w:val="dashed" w:sz="10" w:color="A99FB5"/>
               <w:left w:val="dashed" w:sz="10" w:color="A99FB5"/>
@@ -2845,19 +3142,27 @@
               <w:right w:val="dashed" w:sz="10" w:color="A99FB5"/>
             </w:tcBorders>
             <w:vAlign w:val="center"/>
+            <w:tcMar>
+              <w:top w:w="90" w:type="dxa"/>
+              <w:start w:w="90" w:type="dxa"/>
+              <w:bottom w:w="90" w:type="dxa"/>
+              <w:end w:w="90" w:type="dxa"/>
+            </w:tcMar>
           </w:tcPr>
+          <w:p/>
           <w:p>
             <w:pPr>
-              <w:spacing w:after="140"/>
+              <w:keepNext/>
+              <w:keepLines/>
               <w:jc w:val="center"/>
             </w:pPr>
             <w:r>
               <w:rPr>
                 <w:b/>
-                <w:color w:val="5F3CDF"/>
-                <w:sz w:val="30"/>
+                <w:color w:val="373053"/>
+                <w:sz w:val="18"/>
               </w:rPr>
-              <w:t>INSERT SCREENSHOT HERE</w:t>
+              <w:t>Production dashboard with live Azure data, timing metadata, filters, and four visualizations</w:t>
             </w:r>
           </w:p>
           <w:p>
@@ -2865,11 +3170,38 @@
               <w:jc w:val="center"/>
             </w:pPr>
             <w:r>
-              <w:rPr>
-                <w:color w:val="645B6E"/>
-                <w:sz w:val="19"/>
-              </w:rPr>
-              <w:t>Show the deployed Azure Static Web App with timing cards, filters, and all four visualizations populated.</w:t>
+              <w:drawing>
+                <wp:inline xmlns:a="http://schemas.openxmlformats.org/drawingml/2006/main" xmlns:pic="http://schemas.openxmlformats.org/drawingml/2006/picture">
+                  <wp:extent cx="6080760" cy="3817184"/>
+                  <wp:docPr id="6" name="Picture 6"/>
+                  <wp:cNvGraphicFramePr>
+                    <a:graphicFrameLocks noChangeAspect="1"/>
+                  </wp:cNvGraphicFramePr>
+                  <a:graphic>
+                    <a:graphicData uri="http://schemas.openxmlformats.org/drawingml/2006/picture">
+                      <pic:pic>
+                        <pic:nvPicPr>
+                          <pic:cNvPr id="0" name="Screenshot 2026-07-17 at 7.02.41 PM.png"/>
+                          <pic:cNvPicPr/>
+                        </pic:nvPicPr>
+                        <pic:blipFill>
+                          <a:blip r:embed="rId16"/>
+                          <a:stretch>
+                            <a:fillRect/>
+                          </a:stretch>
+                        </pic:blipFill>
+                        <pic:spPr>
+                          <a:xfrm>
+                            <a:off x="0" y="0"/>
+                            <a:ext cx="6080760" cy="3817184"/>
+                          </a:xfrm>
+                          <a:prstGeom prst="rect"/>
+                        </pic:spPr>
+                      </pic:pic>
+                    </a:graphicData>
+                  </a:graphic>
+                </wp:inline>
+              </w:drawing>
             </w:r>
           </w:p>
         </w:tc>
@@ -2919,7 +3251,7 @@
         <w:tc>
           <w:tcPr>
             <w:tcW w:type="dxa" w:w="10224"/>
-            <w:shd w:fill="F3F1F5"/>
+            <w:shd w:fill="FFFFFF"/>
             <w:tcBorders>
               <w:top w:val="dashed" w:sz="10" w:color="A99FB5"/>
               <w:left w:val="dashed" w:sz="10" w:color="A99FB5"/>
@@ -2927,19 +3259,27 @@
               <w:right w:val="dashed" w:sz="10" w:color="A99FB5"/>
             </w:tcBorders>
             <w:vAlign w:val="center"/>
+            <w:tcMar>
+              <w:top w:w="90" w:type="dxa"/>
+              <w:start w:w="90" w:type="dxa"/>
+              <w:bottom w:w="90" w:type="dxa"/>
+              <w:end w:w="90" w:type="dxa"/>
+            </w:tcMar>
           </w:tcPr>
+          <w:p/>
           <w:p>
             <w:pPr>
-              <w:spacing w:after="140"/>
+              <w:keepNext/>
+              <w:keepLines/>
               <w:jc w:val="center"/>
             </w:pPr>
             <w:r>
               <w:rPr>
                 <w:b/>
-                <w:color w:val="5F3CDF"/>
-                <w:sz w:val="30"/>
+                <w:color w:val="373053"/>
+                <w:sz w:val="18"/>
               </w:rPr>
-              <w:t>INSERT SCREENSHOT HERE</w:t>
+              <w:t>Browser Network test - all three Azure Function requests returned HTTP 200</w:t>
             </w:r>
           </w:p>
           <w:p>
@@ -2947,11 +3287,38 @@
               <w:jc w:val="center"/>
             </w:pPr>
             <w:r>
-              <w:rPr>
-                <w:color w:val="645B6E"/>
-                <w:sz w:val="19"/>
-              </w:rPr>
-              <w:t>Show successful requests from the Static Web App to all three Function endpoints.</w:t>
+              <w:drawing>
+                <wp:inline xmlns:a="http://schemas.openxmlformats.org/drawingml/2006/main" xmlns:pic="http://schemas.openxmlformats.org/drawingml/2006/picture">
+                  <wp:extent cx="6080760" cy="3817184"/>
+                  <wp:docPr id="7" name="Picture 7"/>
+                  <wp:cNvGraphicFramePr>
+                    <a:graphicFrameLocks noChangeAspect="1"/>
+                  </wp:cNvGraphicFramePr>
+                  <a:graphic>
+                    <a:graphicData uri="http://schemas.openxmlformats.org/drawingml/2006/picture">
+                      <pic:pic>
+                        <pic:nvPicPr>
+                          <pic:cNvPr id="0" name="Screenshot 2026-07-17 at 7.05.27 PM.png"/>
+                          <pic:cNvPicPr/>
+                        </pic:nvPicPr>
+                        <pic:blipFill>
+                          <a:blip r:embed="rId17"/>
+                          <a:stretch>
+                            <a:fillRect/>
+                          </a:stretch>
+                        </pic:blipFill>
+                        <pic:spPr>
+                          <a:xfrm>
+                            <a:off x="0" y="0"/>
+                            <a:ext cx="6080760" cy="3817184"/>
+                          </a:xfrm>
+                          <a:prstGeom prst="rect"/>
+                        </pic:spPr>
+                      </pic:pic>
+                    </a:graphicData>
+                  </a:graphic>
+                </wp:inline>
+              </w:drawing>
             </w:r>
           </w:p>
         </w:tc>
@@ -2973,6 +3340,7 @@
     </w:p>
     <w:p>
       <w:pPr>
+        <w:pageBreakBefore/>
         <w:spacing w:before="100" w:after="80"/>
       </w:pPr>
       <w:r>
@@ -2996,7 +3364,7 @@
         <w:tc>
           <w:tcPr>
             <w:tcW w:type="dxa" w:w="10224"/>
-            <w:shd w:fill="F3F1F5"/>
+            <w:shd w:fill="FFFFFF"/>
             <w:tcBorders>
               <w:top w:val="dashed" w:sz="10" w:color="A99FB5"/>
               <w:left w:val="dashed" w:sz="10" w:color="A99FB5"/>
@@ -3004,19 +3372,27 @@
               <w:right w:val="dashed" w:sz="10" w:color="A99FB5"/>
             </w:tcBorders>
             <w:vAlign w:val="center"/>
+            <w:tcMar>
+              <w:top w:w="90" w:type="dxa"/>
+              <w:start w:w="90" w:type="dxa"/>
+              <w:bottom w:w="90" w:type="dxa"/>
+              <w:end w:w="90" w:type="dxa"/>
+            </w:tcMar>
           </w:tcPr>
+          <w:p/>
           <w:p>
             <w:pPr>
-              <w:spacing w:after="140"/>
+              <w:keepNext/>
+              <w:keepLines/>
               <w:jc w:val="center"/>
             </w:pPr>
             <w:r>
               <w:rPr>
                 <w:b/>
-                <w:color w:val="5F3CDF"/>
-                <w:sz w:val="30"/>
+                <w:color w:val="373053"/>
+                <w:sz w:val="18"/>
               </w:rPr>
-              <w:t>INSERT SCREENSHOT HERE</w:t>
+              <w:t>Final GitHub main branch after integration pull request merge</w:t>
             </w:r>
           </w:p>
           <w:p>
@@ -3024,11 +3400,38 @@
               <w:jc w:val="center"/>
             </w:pPr>
             <w:r>
-              <w:rPr>
-                <w:color w:val="645B6E"/>
-                <w:sz w:val="19"/>
-              </w:rPr>
-              <w:t>Show the final repository structure and successful Azure Static Web Apps workflow.</w:t>
+              <w:drawing>
+                <wp:inline xmlns:a="http://schemas.openxmlformats.org/drawingml/2006/main" xmlns:pic="http://schemas.openxmlformats.org/drawingml/2006/picture">
+                  <wp:extent cx="6080760" cy="3817184"/>
+                  <wp:docPr id="8" name="Picture 8"/>
+                  <wp:cNvGraphicFramePr>
+                    <a:graphicFrameLocks noChangeAspect="1"/>
+                  </wp:cNvGraphicFramePr>
+                  <a:graphic>
+                    <a:graphicData uri="http://schemas.openxmlformats.org/drawingml/2006/picture">
+                      <pic:pic>
+                        <pic:nvPicPr>
+                          <pic:cNvPr id="0" name="4d01a934-6007-4924-a322-b728703ae6b0.png"/>
+                          <pic:cNvPicPr/>
+                        </pic:nvPicPr>
+                        <pic:blipFill>
+                          <a:blip r:embed="rId18"/>
+                          <a:stretch>
+                            <a:fillRect/>
+                          </a:stretch>
+                        </pic:blipFill>
+                        <pic:spPr>
+                          <a:xfrm>
+                            <a:off x="0" y="0"/>
+                            <a:ext cx="6080760" cy="3817184"/>
+                          </a:xfrm>
+                          <a:prstGeom prst="rect"/>
+                        </pic:spPr>
+                      </pic:pic>
+                    </a:graphicData>
+                  </a:graphic>
+                </wp:inline>
+              </w:drawing>
             </w:r>
           </w:p>
         </w:tc>
@@ -3089,7 +3492,7 @@
         <w:spacing w:after="80"/>
       </w:pPr>
       <w:r>
-        <w:t>Azure Static Web App deployed from main.</w:t>
+        <w:t>Azure Static Web App deployed to production using SWA CLI.</w:t>
       </w:r>
     </w:p>
     <w:p>
@@ -3144,6 +3547,24 @@
       </w:pPr>
       <w:r>
         <w:t>Submission includes deployed Function URL, frontend URL, GitHub repository, and documentation PDF.</w:t>
+      </w:r>
+    </w:p>
+    <w:p>
+      <w:r>
+        <w:rPr>
+          <w:i/>
+          <w:color w:val="69578E"/>
+          <w:sz w:val="18"/>
+        </w:rPr>
+      </w:r>
+      <w:r/>
+      <w:r>
+        <w:rPr>
+          <w:b w:val="0"/>
+          <w:color w:val="30234C"/>
+          <w:sz w:val="21"/>
+        </w:rPr>
+        <w:t>Current documentation status: complete. All required deployment, backend, integration, testing, GitHub, and architecture evidence has been inserted, and the report is ready for final submission.</w:t>
       </w:r>
     </w:p>
     <w:p>
@@ -3261,7 +3682,7 @@
               <w:rPr>
                 <w:sz w:val="17"/>
               </w:rPr>
-              <w:t>[PASTE AFTER DEPLOYMENT]</w:t>
+              <w:t>https://kind-ocean-0f9378310.7.azurestaticapps.net</w:t>
             </w:r>
           </w:p>
         </w:tc>

</xml_diff>